<commit_message>
Add 8 schematic figures to pharynx & larynx anatomy notes
Axial suprahyoid spaces/fasciae, constrictor gaps incl. sinus of
Morgagni, midsagittal pharynx divisions, RPS/danger/prevertebral
extent, laryngeal PES (sagittal), coronal membranes/PGS/levels,
axial false- vs true-cord level, laryngeal nerves/RLN course.
Each figure carries a Korean caption and its source basis.

Co-Authored-By: Claude Opus 5.5 <noreply@anthropic.com>
Claude-Session: https://claude.ai/code/session_01XiJuGrTpMBDqxf8RuEkTr6
</commit_message>
<xml_diff>
--- a/Pharynx_Larynx_Anatomy_학습노트.docx
+++ b/Pharynx_Larynx_Anatomy_학습노트.docx
@@ -198,6 +198,47 @@
                 <w:szCs w:val="18"/>
               </w:rPr>
               <w:t xml:space="preserve">로 표시했다. 수치 기준(예: 림프절 크기)은 원문으로 확인하기를 권한다.</w:t>
+            </w:r>
+          </w:p>
+          <w:p>
+            <w:pPr>
+              <w:spacing w:after="60"/>
+            </w:pPr>
+            <w:r>
+              <w:rPr>
+                <w:rFonts w:ascii="Malgun Gothic" w:cs="Malgun Gothic" w:eastAsia="Malgun Gothic" w:hAnsi="Malgun Gothic"/>
+                <w:b/>
+                <w:bCs/>
+                <w:sz w:val="18"/>
+                <w:szCs w:val="18"/>
+              </w:rPr>
+              <w:t xml:space="preserve">그림 안내</w:t>
+            </w:r>
+            <w:r>
+              <w:rPr>
+                <w:rFonts w:ascii="Malgun Gothic" w:cs="Malgun Gothic" w:eastAsia="Malgun Gothic" w:hAnsi="Malgun Gothic"/>
+                <w:sz w:val="18"/>
+                <w:szCs w:val="18"/>
+              </w:rPr>
+              <w:t xml:space="preserve">: 그림 1–8은 이 노트를 위해 새로 그린 </w:t>
+            </w:r>
+            <w:r>
+              <w:rPr>
+                <w:rFonts w:ascii="Malgun Gothic" w:cs="Malgun Gothic" w:eastAsia="Malgun Gothic" w:hAnsi="Malgun Gothic"/>
+                <w:b/>
+                <w:bCs/>
+                <w:sz w:val="18"/>
+                <w:szCs w:val="18"/>
+              </w:rPr>
+              <w:t xml:space="preserve">모식도</w:t>
+            </w:r>
+            <w:r>
+              <w:rPr>
+                <w:rFonts w:ascii="Malgun Gothic" w:cs="Malgun Gothic" w:eastAsia="Malgun Gothic" w:hAnsi="Malgun Gothic"/>
+                <w:sz w:val="18"/>
+                <w:szCs w:val="18"/>
+              </w:rPr>
+              <w:t xml:space="preserve">이며 실제 비율은 아니다. 교과서나 논문의 그림을 복제한 것이 아니고, 각 그림 아래에 근거 문헌을 적었다. 그림 속 라벨은 표준 영문 해부학 용어로 적었다.</w:t>
             </w:r>
           </w:p>
           <w:p>
@@ -1139,6 +1180,86 @@
     </w:p>
     <w:p>
       <w:pPr>
+        <w:keepNext/>
+        <w:spacing w:after="60" w:before="160"/>
+        <w:jc w:val="center"/>
+      </w:pPr>
+      <w:r>
+        <w:drawing>
+          <wp:inline distT="0" distB="0" distL="0" distR="0">
+            <wp:extent cx="6096000" cy="4991100"/>
+            <wp:effectExtent t="0" r="0" b="0" l="0"/>
+            <wp:docPr id="1" name="img/fig3.png" descr="그림 1. 정중시상 모식도 — 인두 세 부위의 경계(경구개 평면, 설골/후두개곡 바닥, 윤상연골 하연 ≈ C6). 하인두는 후두의 뒤·옆에 있고, 윤상연골 판 바로 뒤가 윤상후부(postcricoid)다." title="그림 1. 정중시상 모식도"/>
+            <wp:cNvGraphicFramePr>
+              <a:graphicFrameLocks xmlns:a="http://schemas.openxmlformats.org/drawingml/2006/main" noChangeAspect="1"/>
+            </wp:cNvGraphicFramePr>
+            <a:graphic xmlns:a="http://schemas.openxmlformats.org/drawingml/2006/main">
+              <a:graphicData uri="http://schemas.openxmlformats.org/drawingml/2006/picture">
+                <pic:pic xmlns:pic="http://schemas.openxmlformats.org/drawingml/2006/picture">
+                  <pic:nvPicPr>
+                    <pic:cNvPr id="0" name="" descr=""/>
+                    <pic:cNvPicPr>
+                      <a:picLocks noChangeAspect="1" noChangeArrowheads="1"/>
+                    </pic:cNvPicPr>
+                  </pic:nvPicPr>
+                  <pic:blipFill>
+                    <a:blip r:embed="rId7" cstate="none"/>
+                    <a:srcRect/>
+                    <a:stretch>
+                      <a:fillRect/>
+                    </a:stretch>
+                  </pic:blipFill>
+                  <pic:spPr bwMode="auto">
+                    <a:xfrm>
+                      <a:off x="0" y="0"/>
+                      <a:ext cx="6096000" cy="4991100"/>
+                    </a:xfrm>
+                    <a:prstGeom prst="rect">
+                      <a:avLst/>
+                    </a:prstGeom>
+                  </pic:spPr>
+                </pic:pic>
+              </a:graphicData>
+            </a:graphic>
+          </wp:inline>
+        </w:drawing>
+      </w:r>
+    </w:p>
+    <w:p>
+      <w:pPr>
+        <w:keepNext/>
+        <w:spacing w:after="30"/>
+      </w:pPr>
+      <w:r>
+        <w:rPr>
+          <w:rFonts w:ascii="Malgun Gothic" w:cs="Malgun Gothic" w:eastAsia="Malgun Gothic" w:hAnsi="Malgun Gothic"/>
+          <w:b w:val="false"/>
+          <w:bCs w:val="false"/>
+          <w:color w:val="1F4E79"/>
+          <w:sz w:val="18"/>
+          <w:szCs w:val="18"/>
+        </w:rPr>
+        <w:t xml:space="preserve">그림 1. 정중시상 모식도 — 인두 세 부위의 경계(경구개 평면, 설골/후두개곡 바닥, 윤상연골 하연 ≈ C6). 하인두는 후두의 뒤·옆에 있고, 윤상연골 판 바로 뒤가 윤상후부(postcricoid)다.</w:t>
+      </w:r>
+    </w:p>
+    <w:p>
+      <w:pPr>
+        <w:spacing w:after="200"/>
+      </w:pPr>
+      <w:r>
+        <w:rPr>
+          <w:rFonts w:ascii="Malgun Gothic" w:cs="Malgun Gothic" w:eastAsia="Malgun Gothic" w:hAnsi="Malgun Gothic"/>
+          <w:i/>
+          <w:iCs/>
+          <w:color w:val="7F7F7F"/>
+          <w:sz w:val="15"/>
+          <w:szCs w:val="15"/>
+        </w:rPr>
+        <w:t xml:space="preserve">출처: 이 노트용으로 새로 그린 모식도(실제 비율 아님). 근거: AJCC8 해부 정의; Gray; S&amp;C. 척추 높이는 나이와 개인에 따라 다르다.</w:t>
+      </w:r>
+    </w:p>
+    <w:p>
+      <w:pPr>
         <w:pStyle w:val="Heading1"/>
       </w:pPr>
       <w:r>
@@ -1283,6 +1404,86 @@
           <w:szCs w:val="17"/>
         </w:rPr>
         <w:t xml:space="preserve">  └ 익상근막(alar fascia) → 위험공간(danger space) → 척추앞근막(prevertebral fascia) → 척추앞공간</w:t>
+      </w:r>
+    </w:p>
+    <w:p>
+      <w:pPr>
+        <w:keepNext/>
+        <w:spacing w:after="60" w:before="160"/>
+        <w:jc w:val="center"/>
+      </w:pPr>
+      <w:r>
+        <w:drawing>
+          <wp:inline distT="0" distB="0" distL="0" distR="0">
+            <wp:extent cx="6096000" cy="3990975"/>
+            <wp:effectExtent t="0" r="0" b="0" l="0"/>
+            <wp:docPr id="1" name="img/fig1.png" descr="그림 2. 설골상부 축상 모식도(비인두~상부 구인두 높이, 위가 앞쪽) — PMS 안의 인두기저근막(초록 점선), 수축근, 그 바깥의 협인두근막(파란 실선, MLDCF). 뒤로 인두후공간 → 익상근막(주황 점선) → 위험공간 → 척추앞근막(초록 실선). 옆으로 PPS 지방, 저작근공간, 경동맥공간, 이하선공간." title="그림 2. 설골상부 축상 모식도(비인두~상부 구인두 높이, 위가 앞쪽)"/>
+            <wp:cNvGraphicFramePr>
+              <a:graphicFrameLocks xmlns:a="http://schemas.openxmlformats.org/drawingml/2006/main" noChangeAspect="1"/>
+            </wp:cNvGraphicFramePr>
+            <a:graphic xmlns:a="http://schemas.openxmlformats.org/drawingml/2006/main">
+              <a:graphicData uri="http://schemas.openxmlformats.org/drawingml/2006/picture">
+                <pic:pic xmlns:pic="http://schemas.openxmlformats.org/drawingml/2006/picture">
+                  <pic:nvPicPr>
+                    <pic:cNvPr id="0" name="" descr=""/>
+                    <pic:cNvPicPr>
+                      <a:picLocks noChangeAspect="1" noChangeArrowheads="1"/>
+                    </pic:cNvPicPr>
+                  </pic:nvPicPr>
+                  <pic:blipFill>
+                    <a:blip r:embed="rId8" cstate="none"/>
+                    <a:srcRect/>
+                    <a:stretch>
+                      <a:fillRect/>
+                    </a:stretch>
+                  </pic:blipFill>
+                  <pic:spPr bwMode="auto">
+                    <a:xfrm>
+                      <a:off x="0" y="0"/>
+                      <a:ext cx="6096000" cy="3990975"/>
+                    </a:xfrm>
+                    <a:prstGeom prst="rect">
+                      <a:avLst/>
+                    </a:prstGeom>
+                  </pic:spPr>
+                </pic:pic>
+              </a:graphicData>
+            </a:graphic>
+          </wp:inline>
+        </w:drawing>
+      </w:r>
+    </w:p>
+    <w:p>
+      <w:pPr>
+        <w:keepNext/>
+        <w:spacing w:after="30"/>
+      </w:pPr>
+      <w:r>
+        <w:rPr>
+          <w:rFonts w:ascii="Malgun Gothic" w:cs="Malgun Gothic" w:eastAsia="Malgun Gothic" w:hAnsi="Malgun Gothic"/>
+          <w:b w:val="false"/>
+          <w:bCs w:val="false"/>
+          <w:color w:val="1F4E79"/>
+          <w:sz w:val="18"/>
+          <w:szCs w:val="18"/>
+        </w:rPr>
+        <w:t xml:space="preserve">그림 2. 설골상부 축상 모식도(비인두~상부 구인두 높이, 위가 앞쪽) — PMS 안의 인두기저근막(초록 점선), 수축근, 그 바깥의 협인두근막(파란 실선, MLDCF). 뒤로 인두후공간 → 익상근막(주황 점선) → 위험공간 → 척추앞근막(초록 실선). 옆으로 PPS 지방, 저작근공간, 경동맥공간, 이하선공간.</w:t>
+      </w:r>
+    </w:p>
+    <w:p>
+      <w:pPr>
+        <w:spacing w:after="200"/>
+      </w:pPr>
+      <w:r>
+        <w:rPr>
+          <w:rFonts w:ascii="Malgun Gothic" w:cs="Malgun Gothic" w:eastAsia="Malgun Gothic" w:hAnsi="Malgun Gothic"/>
+          <w:i/>
+          <w:iCs/>
+          <w:color w:val="7F7F7F"/>
+          <w:sz w:val="15"/>
+          <w:szCs w:val="15"/>
+        </w:rPr>
+        <w:t xml:space="preserve">출처: 새로 그린 모식도. 근거: DI-HN (PMS, PPS, RPS, Perivertebral space 장); S&amp;C. 공간 경계는 Harnsberger식 개념을 따랐다.</w:t>
       </w:r>
     </w:p>
     <w:p>
@@ -2205,6 +2406,86 @@
       <w:pPr>
         <w:spacing w:after="80"/>
       </w:pPr>
+    </w:p>
+    <w:p>
+      <w:pPr>
+        <w:keepNext/>
+        <w:spacing w:after="60" w:before="160"/>
+        <w:jc w:val="center"/>
+      </w:pPr>
+      <w:r>
+        <w:drawing>
+          <wp:inline distT="0" distB="0" distL="0" distR="0">
+            <wp:extent cx="6096000" cy="5429250"/>
+            <wp:effectExtent t="0" r="0" b="0" l="0"/>
+            <wp:docPr id="1" name="img/fig2.png" descr="그림 3. 인두수축근 뒤쪽 모식도 — 두개저와 상인두수축근 사이의 초록 부분이 인두기저근막만 덮인 Morgagni동이다. 이관, 구개올림근, 상행구개동맥이 이곳을 지난다. 근육 사이 틈을 지나는 구조(CN IX·경돌인두근, 상후두신경 내지·상후두동맥, RLN·하후두동맥)와 Killian dehiscence도 표시했다." title="그림 3. 인두수축근 뒤쪽 모식도"/>
+            <wp:cNvGraphicFramePr>
+              <a:graphicFrameLocks xmlns:a="http://schemas.openxmlformats.org/drawingml/2006/main" noChangeAspect="1"/>
+            </wp:cNvGraphicFramePr>
+            <a:graphic xmlns:a="http://schemas.openxmlformats.org/drawingml/2006/main">
+              <a:graphicData uri="http://schemas.openxmlformats.org/drawingml/2006/picture">
+                <pic:pic xmlns:pic="http://schemas.openxmlformats.org/drawingml/2006/picture">
+                  <pic:nvPicPr>
+                    <pic:cNvPr id="0" name="" descr=""/>
+                    <pic:cNvPicPr>
+                      <a:picLocks noChangeAspect="1" noChangeArrowheads="1"/>
+                    </pic:cNvPicPr>
+                  </pic:nvPicPr>
+                  <pic:blipFill>
+                    <a:blip r:embed="rId9" cstate="none"/>
+                    <a:srcRect/>
+                    <a:stretch>
+                      <a:fillRect/>
+                    </a:stretch>
+                  </pic:blipFill>
+                  <pic:spPr bwMode="auto">
+                    <a:xfrm>
+                      <a:off x="0" y="0"/>
+                      <a:ext cx="6096000" cy="5429250"/>
+                    </a:xfrm>
+                    <a:prstGeom prst="rect">
+                      <a:avLst/>
+                    </a:prstGeom>
+                  </pic:spPr>
+                </pic:pic>
+              </a:graphicData>
+            </a:graphic>
+          </wp:inline>
+        </w:drawing>
+      </w:r>
+    </w:p>
+    <w:p>
+      <w:pPr>
+        <w:keepNext/>
+        <w:spacing w:after="30"/>
+      </w:pPr>
+      <w:r>
+        <w:rPr>
+          <w:rFonts w:ascii="Malgun Gothic" w:cs="Malgun Gothic" w:eastAsia="Malgun Gothic" w:hAnsi="Malgun Gothic"/>
+          <w:b w:val="false"/>
+          <w:bCs w:val="false"/>
+          <w:color w:val="1F4E79"/>
+          <w:sz w:val="18"/>
+          <w:szCs w:val="18"/>
+        </w:rPr>
+        <w:t xml:space="preserve">그림 3. 인두수축근 뒤쪽 모식도 — 두개저와 상인두수축근 사이의 초록 부분이 인두기저근막만 덮인 Morgagni동이다. 이관, 구개올림근, 상행구개동맥이 이곳을 지난다. 근육 사이 틈을 지나는 구조(CN IX·경돌인두근, 상후두신경 내지·상후두동맥, RLN·하후두동맥)와 Killian dehiscence도 표시했다.</w:t>
+      </w:r>
+    </w:p>
+    <w:p>
+      <w:pPr>
+        <w:spacing w:after="200"/>
+      </w:pPr>
+      <w:r>
+        <w:rPr>
+          <w:rFonts w:ascii="Malgun Gothic" w:cs="Malgun Gothic" w:eastAsia="Malgun Gothic" w:hAnsi="Malgun Gothic"/>
+          <w:i/>
+          <w:iCs/>
+          <w:color w:val="7F7F7F"/>
+          <w:sz w:val="15"/>
+          <w:szCs w:val="15"/>
+        </w:rPr>
+        <w:t xml:space="preserve">출처: 새로 그린 모식도(근육 형태는 단순화함). 근거: Gray (pharyngeal constrictors, gaps).</w:t>
+      </w:r>
     </w:p>
     <w:p>
       <w:pPr>
@@ -4054,6 +4335,86 @@
     </w:p>
     <w:p>
       <w:pPr>
+        <w:keepNext/>
+        <w:spacing w:after="60" w:before="160"/>
+        <w:jc w:val="center"/>
+      </w:pPr>
+      <w:r>
+        <w:drawing>
+          <wp:inline distT="0" distB="0" distL="0" distR="0">
+            <wp:extent cx="6096000" cy="4391025"/>
+            <wp:effectExtent t="0" r="0" b="0" l="0"/>
+            <wp:docPr id="1" name="img/fig7.png" descr="그림 4. 시상 모식도 — 인두후공간(노랑)은 두개저부터 익상근막이 내장근막과 붙는 곳(약 T1–T6, 개인차)까지 이어진다. 위험공간(연주황)은 후종격동의 횡격막 높이까지, 척추앞공간은 미골까지 이어진다. 설골상부 인두후공간에만 림프절이 있다." title="그림 4. 시상 모식도"/>
+            <wp:cNvGraphicFramePr>
+              <a:graphicFrameLocks xmlns:a="http://schemas.openxmlformats.org/drawingml/2006/main" noChangeAspect="1"/>
+            </wp:cNvGraphicFramePr>
+            <a:graphic xmlns:a="http://schemas.openxmlformats.org/drawingml/2006/main">
+              <a:graphicData uri="http://schemas.openxmlformats.org/drawingml/2006/picture">
+                <pic:pic xmlns:pic="http://schemas.openxmlformats.org/drawingml/2006/picture">
+                  <pic:nvPicPr>
+                    <pic:cNvPr id="0" name="" descr=""/>
+                    <pic:cNvPicPr>
+                      <a:picLocks noChangeAspect="1" noChangeArrowheads="1"/>
+                    </pic:cNvPicPr>
+                  </pic:nvPicPr>
+                  <pic:blipFill>
+                    <a:blip r:embed="rId10" cstate="none"/>
+                    <a:srcRect/>
+                    <a:stretch>
+                      <a:fillRect/>
+                    </a:stretch>
+                  </pic:blipFill>
+                  <pic:spPr bwMode="auto">
+                    <a:xfrm>
+                      <a:off x="0" y="0"/>
+                      <a:ext cx="6096000" cy="4391025"/>
+                    </a:xfrm>
+                    <a:prstGeom prst="rect">
+                      <a:avLst/>
+                    </a:prstGeom>
+                  </pic:spPr>
+                </pic:pic>
+              </a:graphicData>
+            </a:graphic>
+          </wp:inline>
+        </w:drawing>
+      </w:r>
+    </w:p>
+    <w:p>
+      <w:pPr>
+        <w:keepNext/>
+        <w:spacing w:after="30"/>
+      </w:pPr>
+      <w:r>
+        <w:rPr>
+          <w:rFonts w:ascii="Malgun Gothic" w:cs="Malgun Gothic" w:eastAsia="Malgun Gothic" w:hAnsi="Malgun Gothic"/>
+          <w:b w:val="false"/>
+          <w:bCs w:val="false"/>
+          <w:color w:val="1F4E79"/>
+          <w:sz w:val="18"/>
+          <w:szCs w:val="18"/>
+        </w:rPr>
+        <w:t xml:space="preserve">그림 4. 시상 모식도 — 인두후공간(노랑)은 두개저부터 익상근막이 내장근막과 붙는 곳(약 T1–T6, 개인차)까지 이어진다. 위험공간(연주황)은 후종격동의 횡격막 높이까지, 척추앞공간은 미골까지 이어진다. 설골상부 인두후공간에만 림프절이 있다.</w:t>
+      </w:r>
+    </w:p>
+    <w:p>
+      <w:pPr>
+        <w:spacing w:after="200"/>
+      </w:pPr>
+      <w:r>
+        <w:rPr>
+          <w:rFonts w:ascii="Malgun Gothic" w:cs="Malgun Gothic" w:eastAsia="Malgun Gothic" w:hAnsi="Malgun Gothic"/>
+          <w:i/>
+          <w:iCs/>
+          <w:color w:val="7F7F7F"/>
+          <w:sz w:val="15"/>
+          <w:szCs w:val="15"/>
+        </w:rPr>
+        <w:t xml:space="preserve">출처: 새로 그린 모식도. 근거: Debnam JM, Guha-Thakurta N. Otolaryngol Clin North Am 2012;45:1293–1310 (PMID 23153750); DI-HN.</w:t>
+      </w:r>
+    </w:p>
+    <w:p>
+      <w:pPr>
         <w:pStyle w:val="ListParagraph"/>
         <w:numPr>
           <w:ilvl w:val="0"/>
@@ -4615,6 +4976,45 @@
           <w:rFonts w:ascii="Malgun Gothic" w:cs="Malgun Gothic" w:eastAsia="Malgun Gothic" w:hAnsi="Malgun Gothic"/>
         </w:rPr>
         <w:t xml:space="preserve">.</w:t>
+      </w:r>
+    </w:p>
+    <w:p>
+      <w:pPr>
+        <w:spacing w:after="100"/>
+      </w:pPr>
+      <w:r>
+        <w:rPr>
+          <w:rFonts w:ascii="Malgun Gothic" w:cs="Malgun Gothic" w:eastAsia="Malgun Gothic" w:hAnsi="Malgun Gothic"/>
+        </w:rPr>
+        <w:t xml:space="preserve">→ Morgagni동의 위치와 통과 구조는 </w:t>
+      </w:r>
+      <w:r>
+        <w:rPr>
+          <w:rFonts w:ascii="Malgun Gothic" w:cs="Malgun Gothic" w:eastAsia="Malgun Gothic" w:hAnsi="Malgun Gothic"/>
+          <w:b/>
+          <w:bCs/>
+        </w:rPr>
+        <w:t xml:space="preserve">그림 3</w:t>
+      </w:r>
+      <w:r>
+        <w:rPr>
+          <w:rFonts w:ascii="Malgun Gothic" w:cs="Malgun Gothic" w:eastAsia="Malgun Gothic" w:hAnsi="Malgun Gothic"/>
+        </w:rPr>
+        <w:t xml:space="preserve">, 인두기저근막과 PPS의 관계는 </w:t>
+      </w:r>
+      <w:r>
+        <w:rPr>
+          <w:rFonts w:ascii="Malgun Gothic" w:cs="Malgun Gothic" w:eastAsia="Malgun Gothic" w:hAnsi="Malgun Gothic"/>
+          <w:b/>
+          <w:bCs/>
+        </w:rPr>
+        <w:t xml:space="preserve">그림 2</w:t>
+      </w:r>
+      <w:r>
+        <w:rPr>
+          <w:rFonts w:ascii="Malgun Gothic" w:cs="Malgun Gothic" w:eastAsia="Malgun Gothic" w:hAnsi="Malgun Gothic"/>
+        </w:rPr>
+        <w:t xml:space="preserve">를 참고하라.</w:t>
       </w:r>
     </w:p>
     <w:p>
@@ -9664,6 +10064,86 @@
     </w:p>
     <w:p>
       <w:pPr>
+        <w:keepNext/>
+        <w:spacing w:after="60" w:before="160"/>
+        <w:jc w:val="center"/>
+      </w:pPr>
+      <w:r>
+        <w:drawing>
+          <wp:inline distT="0" distB="0" distL="0" distR="0">
+            <wp:extent cx="6096000" cy="4000500"/>
+            <wp:effectExtent t="0" r="0" b="0" l="0"/>
+            <wp:docPr id="1" name="img/fig5.png" descr="그림 5. 후두 정중시상 모식도 — 후두개앞공간(PES, 노랑)의 천장은 설골후두개인대(초록)이다. 앞쪽은 갑상설골막과 갑상연골, 뒤쪽은 후두개가 경계를 이룬다. 후두개의 구멍(fenestrations)을 통해 후두개 암이 PES로 번진다. 앞 교련(빨간 원)에는 안쪽 연골막이 없다." title="그림 5. 후두 정중시상 모식도"/>
+            <wp:cNvGraphicFramePr>
+              <a:graphicFrameLocks xmlns:a="http://schemas.openxmlformats.org/drawingml/2006/main" noChangeAspect="1"/>
+            </wp:cNvGraphicFramePr>
+            <a:graphic xmlns:a="http://schemas.openxmlformats.org/drawingml/2006/main">
+              <a:graphicData uri="http://schemas.openxmlformats.org/drawingml/2006/picture">
+                <pic:pic xmlns:pic="http://schemas.openxmlformats.org/drawingml/2006/picture">
+                  <pic:nvPicPr>
+                    <pic:cNvPr id="0" name="" descr=""/>
+                    <pic:cNvPicPr>
+                      <a:picLocks noChangeAspect="1" noChangeArrowheads="1"/>
+                    </pic:cNvPicPr>
+                  </pic:nvPicPr>
+                  <pic:blipFill>
+                    <a:blip r:embed="rId11" cstate="none"/>
+                    <a:srcRect/>
+                    <a:stretch>
+                      <a:fillRect/>
+                    </a:stretch>
+                  </pic:blipFill>
+                  <pic:spPr bwMode="auto">
+                    <a:xfrm>
+                      <a:off x="0" y="0"/>
+                      <a:ext cx="6096000" cy="4000500"/>
+                    </a:xfrm>
+                    <a:prstGeom prst="rect">
+                      <a:avLst/>
+                    </a:prstGeom>
+                  </pic:spPr>
+                </pic:pic>
+              </a:graphicData>
+            </a:graphic>
+          </wp:inline>
+        </w:drawing>
+      </w:r>
+    </w:p>
+    <w:p>
+      <w:pPr>
+        <w:keepNext/>
+        <w:spacing w:after="30"/>
+      </w:pPr>
+      <w:r>
+        <w:rPr>
+          <w:rFonts w:ascii="Malgun Gothic" w:cs="Malgun Gothic" w:eastAsia="Malgun Gothic" w:hAnsi="Malgun Gothic"/>
+          <w:b w:val="false"/>
+          <w:bCs w:val="false"/>
+          <w:color w:val="1F4E79"/>
+          <w:sz w:val="18"/>
+          <w:szCs w:val="18"/>
+        </w:rPr>
+        <w:t xml:space="preserve">그림 5. 후두 정중시상 모식도 — 후두개앞공간(PES, 노랑)의 천장은 설골후두개인대(초록)이다. 앞쪽은 갑상설골막과 갑상연골, 뒤쪽은 후두개가 경계를 이룬다. 후두개의 구멍(fenestrations)을 통해 후두개 암이 PES로 번진다. 앞 교련(빨간 원)에는 안쪽 연골막이 없다.</w:t>
+      </w:r>
+    </w:p>
+    <w:p>
+      <w:pPr>
+        <w:spacing w:after="200"/>
+      </w:pPr>
+      <w:r>
+        <w:rPr>
+          <w:rFonts w:ascii="Malgun Gothic" w:cs="Malgun Gothic" w:eastAsia="Malgun Gothic" w:hAnsi="Malgun Gothic"/>
+          <w:i/>
+          <w:iCs/>
+          <w:color w:val="7F7F7F"/>
+          <w:sz w:val="15"/>
+          <w:szCs w:val="15"/>
+        </w:rPr>
+        <w:t xml:space="preserve">출처: 새로 그린 모식도. 근거: Gray; S&amp;C; Curtin HD. Radiology 1989;173:1–11 (PMID 2675175).</w:t>
+      </w:r>
+    </w:p>
+    <w:p>
+      <w:pPr>
         <w:pStyle w:val="ListParagraph"/>
         <w:numPr>
           <w:ilvl w:val="0"/>
@@ -10315,6 +10795,86 @@
     </w:p>
     <w:p>
       <w:pPr>
+        <w:keepNext/>
+        <w:spacing w:after="60" w:before="160"/>
+        <w:jc w:val="center"/>
+      </w:pPr>
+      <w:r>
+        <w:drawing>
+          <wp:inline distT="0" distB="0" distL="0" distR="0">
+            <wp:extent cx="6096000" cy="4219575"/>
+            <wp:effectExtent t="0" r="0" b="0" l="0"/>
+            <wp:docPr id="1" name="img/fig4.png" descr="그림 6. 후두 관상 모식도 — 성문상부 PGS(지방)의 안쪽 경계는 사각막(파랑)이고, 성문·성문하부의 안쪽 경계는 탄력원뿔(주황)이다. 가성대와 진성대 사이가 후두실(ventricle of Morgagni)이고, 후두소낭(saccule)은 그 앞위쪽으로 뻗는다. 오른쪽 막대는 AJCC8 기준 성문상부·성문·성문하부의 구분이다." title="그림 6. 후두 관상 모식도"/>
+            <wp:cNvGraphicFramePr>
+              <a:graphicFrameLocks xmlns:a="http://schemas.openxmlformats.org/drawingml/2006/main" noChangeAspect="1"/>
+            </wp:cNvGraphicFramePr>
+            <a:graphic xmlns:a="http://schemas.openxmlformats.org/drawingml/2006/main">
+              <a:graphicData uri="http://schemas.openxmlformats.org/drawingml/2006/picture">
+                <pic:pic xmlns:pic="http://schemas.openxmlformats.org/drawingml/2006/picture">
+                  <pic:nvPicPr>
+                    <pic:cNvPr id="0" name="" descr=""/>
+                    <pic:cNvPicPr>
+                      <a:picLocks noChangeAspect="1" noChangeArrowheads="1"/>
+                    </pic:cNvPicPr>
+                  </pic:nvPicPr>
+                  <pic:blipFill>
+                    <a:blip r:embed="rId12" cstate="none"/>
+                    <a:srcRect/>
+                    <a:stretch>
+                      <a:fillRect/>
+                    </a:stretch>
+                  </pic:blipFill>
+                  <pic:spPr bwMode="auto">
+                    <a:xfrm>
+                      <a:off x="0" y="0"/>
+                      <a:ext cx="6096000" cy="4219575"/>
+                    </a:xfrm>
+                    <a:prstGeom prst="rect">
+                      <a:avLst/>
+                    </a:prstGeom>
+                  </pic:spPr>
+                </pic:pic>
+              </a:graphicData>
+            </a:graphic>
+          </wp:inline>
+        </w:drawing>
+      </w:r>
+    </w:p>
+    <w:p>
+      <w:pPr>
+        <w:keepNext/>
+        <w:spacing w:after="30"/>
+      </w:pPr>
+      <w:r>
+        <w:rPr>
+          <w:rFonts w:ascii="Malgun Gothic" w:cs="Malgun Gothic" w:eastAsia="Malgun Gothic" w:hAnsi="Malgun Gothic"/>
+          <w:b w:val="false"/>
+          <w:bCs w:val="false"/>
+          <w:color w:val="1F4E79"/>
+          <w:sz w:val="18"/>
+          <w:szCs w:val="18"/>
+        </w:rPr>
+        <w:t xml:space="preserve">그림 6. 후두 관상 모식도 — 성문상부 PGS(지방)의 안쪽 경계는 사각막(파랑)이고, 성문·성문하부의 안쪽 경계는 탄력원뿔(주황)이다. 가성대와 진성대 사이가 후두실(ventricle of Morgagni)이고, 후두소낭(saccule)은 그 앞위쪽으로 뻗는다. 오른쪽 막대는 AJCC8 기준 성문상부·성문·성문하부의 구분이다.</w:t>
+      </w:r>
+    </w:p>
+    <w:p>
+      <w:pPr>
+        <w:spacing w:after="200"/>
+      </w:pPr>
+      <w:r>
+        <w:rPr>
+          <w:rFonts w:ascii="Malgun Gothic" w:cs="Malgun Gothic" w:eastAsia="Malgun Gothic" w:hAnsi="Malgun Gothic"/>
+          <w:i/>
+          <w:iCs/>
+          <w:color w:val="7F7F7F"/>
+          <w:sz w:val="15"/>
+          <w:szCs w:val="15"/>
+        </w:rPr>
+        <w:t xml:space="preserve">출처: 새로 그린 모식도(여러 관상면을 합친 것이며 실제 비율 아님). 근거: Gray; S&amp;C; AJCC8.</w:t>
+      </w:r>
+    </w:p>
+    <w:p>
+      <w:pPr>
         <w:pStyle w:val="ListParagraph"/>
         <w:numPr>
           <w:ilvl w:val="0"/>
@@ -10832,6 +11392,86 @@
       <w:pPr>
         <w:spacing w:after="80"/>
       </w:pPr>
+    </w:p>
+    <w:p>
+      <w:pPr>
+        <w:keepNext/>
+        <w:spacing w:after="60" w:before="160"/>
+        <w:jc w:val="center"/>
+      </w:pPr>
+      <w:r>
+        <w:drawing>
+          <wp:inline distT="0" distB="0" distL="0" distR="0">
+            <wp:extent cx="6096000" cy="3543300"/>
+            <wp:effectExtent t="0" r="0" b="0" l="0"/>
+            <wp:docPr id="1" name="img/fig6.png" descr="그림 7. 축상 CT 높이 구분 모식도 — (A) 가성대 높이: 후두옆공간에 지방(저음영)이 있고 피열연골 윗부분이 보인다. (B) 진성대 높이: 갑상피열근이 후두옆공간을 채워 지방이 없고, 피열연골 성대돌기와 윤상연골 판 윗부분이 보인다. 앞 교련 점막은 얇다." title="그림 7. 축상 CT 높이 구분 모식도"/>
+            <wp:cNvGraphicFramePr>
+              <a:graphicFrameLocks xmlns:a="http://schemas.openxmlformats.org/drawingml/2006/main" noChangeAspect="1"/>
+            </wp:cNvGraphicFramePr>
+            <a:graphic xmlns:a="http://schemas.openxmlformats.org/drawingml/2006/main">
+              <a:graphicData uri="http://schemas.openxmlformats.org/drawingml/2006/picture">
+                <pic:pic xmlns:pic="http://schemas.openxmlformats.org/drawingml/2006/picture">
+                  <pic:nvPicPr>
+                    <pic:cNvPr id="0" name="" descr=""/>
+                    <pic:cNvPicPr>
+                      <a:picLocks noChangeAspect="1" noChangeArrowheads="1"/>
+                    </pic:cNvPicPr>
+                  </pic:nvPicPr>
+                  <pic:blipFill>
+                    <a:blip r:embed="rId13" cstate="none"/>
+                    <a:srcRect/>
+                    <a:stretch>
+                      <a:fillRect/>
+                    </a:stretch>
+                  </pic:blipFill>
+                  <pic:spPr bwMode="auto">
+                    <a:xfrm>
+                      <a:off x="0" y="0"/>
+                      <a:ext cx="6096000" cy="3543300"/>
+                    </a:xfrm>
+                    <a:prstGeom prst="rect">
+                      <a:avLst/>
+                    </a:prstGeom>
+                  </pic:spPr>
+                </pic:pic>
+              </a:graphicData>
+            </a:graphic>
+          </wp:inline>
+        </w:drawing>
+      </w:r>
+    </w:p>
+    <w:p>
+      <w:pPr>
+        <w:keepNext/>
+        <w:spacing w:after="30"/>
+      </w:pPr>
+      <w:r>
+        <w:rPr>
+          <w:rFonts w:ascii="Malgun Gothic" w:cs="Malgun Gothic" w:eastAsia="Malgun Gothic" w:hAnsi="Malgun Gothic"/>
+          <w:b w:val="false"/>
+          <w:bCs w:val="false"/>
+          <w:color w:val="1F4E79"/>
+          <w:sz w:val="18"/>
+          <w:szCs w:val="18"/>
+        </w:rPr>
+        <w:t xml:space="preserve">그림 7. 축상 CT 높이 구분 모식도 — (A) 가성대 높이: 후두옆공간에 지방(저음영)이 있고 피열연골 윗부분이 보인다. (B) 진성대 높이: 갑상피열근이 후두옆공간을 채워 지방이 없고, 피열연골 성대돌기와 윤상연골 판 윗부분이 보인다. 앞 교련 점막은 얇다.</w:t>
+      </w:r>
+    </w:p>
+    <w:p>
+      <w:pPr>
+        <w:spacing w:after="200"/>
+      </w:pPr>
+      <w:r>
+        <w:rPr>
+          <w:rFonts w:ascii="Malgun Gothic" w:cs="Malgun Gothic" w:eastAsia="Malgun Gothic" w:hAnsi="Malgun Gothic"/>
+          <w:i/>
+          <w:iCs/>
+          <w:color w:val="7F7F7F"/>
+          <w:sz w:val="15"/>
+          <w:szCs w:val="15"/>
+        </w:rPr>
+        <w:t xml:space="preserve">출처: 새로 그린 모식도. 근거: Curtin 1989 (PMID 2675175); Becker M. Radiol Clin North Am 1998;36:891–920 (PMID 9747193); Joshi 2012 (PMID 23599569).</w:t>
+      </w:r>
     </w:p>
     <w:p>
       <w:pPr>
@@ -11677,6 +12317,86 @@
           <w:rFonts w:ascii="Malgun Gothic" w:cs="Malgun Gothic" w:eastAsia="Malgun Gothic" w:hAnsi="Malgun Gothic"/>
         </w:rPr>
         <w:t xml:space="preserve">까지, 오른쪽은 쇄골하동맥 높이까지.</w:t>
+      </w:r>
+    </w:p>
+    <w:p>
+      <w:pPr>
+        <w:keepNext/>
+        <w:spacing w:after="60" w:before="160"/>
+        <w:jc w:val="center"/>
+      </w:pPr>
+      <w:r>
+        <w:drawing>
+          <wp:inline distT="0" distB="0" distL="0" distR="0">
+            <wp:extent cx="6096000" cy="5324475"/>
+            <wp:effectExtent t="0" r="0" b="0" l="0"/>
+            <wp:docPr id="1" name="img/fig8.png" descr="그림 8. 후두 신경 모식도(앞에서 본 모습) — 상후두신경 내지(성대 위 감각, 갑상설골막 통과)와 외지(윤상갑상근만 지배). 오른쪽 RLN은 쇄골하동맥 아래를, 왼쪽 RLN은 동맥관인대 부위의 대동맥궁 아래를 돌아 기관식도고랑으로 올라간다." title="그림 8. 후두 신경 모식도(앞에서 본 모습)"/>
+            <wp:cNvGraphicFramePr>
+              <a:graphicFrameLocks xmlns:a="http://schemas.openxmlformats.org/drawingml/2006/main" noChangeAspect="1"/>
+            </wp:cNvGraphicFramePr>
+            <a:graphic xmlns:a="http://schemas.openxmlformats.org/drawingml/2006/main">
+              <a:graphicData uri="http://schemas.openxmlformats.org/drawingml/2006/picture">
+                <pic:pic xmlns:pic="http://schemas.openxmlformats.org/drawingml/2006/picture">
+                  <pic:nvPicPr>
+                    <pic:cNvPr id="0" name="" descr=""/>
+                    <pic:cNvPicPr>
+                      <a:picLocks noChangeAspect="1" noChangeArrowheads="1"/>
+                    </pic:cNvPicPr>
+                  </pic:nvPicPr>
+                  <pic:blipFill>
+                    <a:blip r:embed="rId14" cstate="none"/>
+                    <a:srcRect/>
+                    <a:stretch>
+                      <a:fillRect/>
+                    </a:stretch>
+                  </pic:blipFill>
+                  <pic:spPr bwMode="auto">
+                    <a:xfrm>
+                      <a:off x="0" y="0"/>
+                      <a:ext cx="6096000" cy="5324475"/>
+                    </a:xfrm>
+                    <a:prstGeom prst="rect">
+                      <a:avLst/>
+                    </a:prstGeom>
+                  </pic:spPr>
+                </pic:pic>
+              </a:graphicData>
+            </a:graphic>
+          </wp:inline>
+        </w:drawing>
+      </w:r>
+    </w:p>
+    <w:p>
+      <w:pPr>
+        <w:keepNext/>
+        <w:spacing w:after="30"/>
+      </w:pPr>
+      <w:r>
+        <w:rPr>
+          <w:rFonts w:ascii="Malgun Gothic" w:cs="Malgun Gothic" w:eastAsia="Malgun Gothic" w:hAnsi="Malgun Gothic"/>
+          <w:b w:val="false"/>
+          <w:bCs w:val="false"/>
+          <w:color w:val="1F4E79"/>
+          <w:sz w:val="18"/>
+          <w:szCs w:val="18"/>
+        </w:rPr>
+        <w:t xml:space="preserve">그림 8. 후두 신경 모식도(앞에서 본 모습) — 상후두신경 내지(성대 위 감각, 갑상설골막 통과)와 외지(윤상갑상근만 지배). 오른쪽 RLN은 쇄골하동맥 아래를, 왼쪽 RLN은 동맥관인대 부위의 대동맥궁 아래를 돌아 기관식도고랑으로 올라간다.</w:t>
+      </w:r>
+    </w:p>
+    <w:p>
+      <w:pPr>
+        <w:spacing w:after="200"/>
+      </w:pPr>
+      <w:r>
+        <w:rPr>
+          <w:rFonts w:ascii="Malgun Gothic" w:cs="Malgun Gothic" w:eastAsia="Malgun Gothic" w:hAnsi="Malgun Gothic"/>
+          <w:i/>
+          <w:iCs/>
+          <w:color w:val="7F7F7F"/>
+          <w:sz w:val="15"/>
+          <w:szCs w:val="15"/>
+        </w:rPr>
+        <w:t xml:space="preserve">출처: 새로 그린 모식도(혈관 형태는 단순화함). 근거: Gray; Paquette CM et al. RadioGraphics 2012;32:721–740 (PMID 22582356).</w:t>
       </w:r>
     </w:p>
     <w:p>

</xml_diff>